<commit_message>
fix(doc): update thesis with visual analysis, complete tables, and refined conclusions
</commit_message>
<xml_diff>
--- a/вкр_доработанная.docx
+++ b/вкр_доработанная.docx
@@ -7328,7 +7328,7 @@
           <w:i/>
           <w:lang w:val="ru-RU"/>
         </w:rPr>
-        <w:t>Примечание: данные по канцеляризмам, просторечиям и неоправданным заимствованиям приведены в нормированном виде — количество выявленных случаев на 10 проанализированных материалов. Это позволяет сопоставлять издания, несмотря на разный объём выборки (от 17 до 32 материалов). Окказионализмы и оценочная лексика оцениваются качественно по причине трудностей формализации этих категорий.</w:t>
+        <w:t>Примечание: данные по канцеляризмам, просторечиям и неоправданным заимствованиям приведены в нормированном виде — количество выявленных случаев на 10 проанализированных материалов. Это позволяет сопоставлять издания, несмотря на разный объём выборки (от 17 до 32 материалов). Окказионализмы и оценочная лексика приведены с пометками «отсутствуют / редко / средне / часто / низко / средне / высоко / очень высоко», что позволяет сопоставить их распределение по изданиям без ущерба для строгости анализа. Подробнее по окказионализмам — таблица 3а.</w:t>
       </w:r>
     </w:p>
     <w:p>
@@ -7417,6 +7417,487 @@
     </w:p>
     <w:p>
       <w:pPr>
+        <w:rPr>
+          <w:lang w:val="ru-RU"/>
+        </w:rPr>
+      </w:pPr>
+      <w:r>
+        <w:rPr>
+          <w:lang w:val="ru-RU"/>
+        </w:rPr>
+        <w:t xml:space="preserve">Таблица 3а — Окказионализмы и индивидуально-авторские образования в проанализированных изданиях</w:t>
+      </w:r>
+    </w:p>
+    <w:tbl>
+      <w:tblPr>
+        <w:tblW w:w="9000" w:type="dxa"/>
+        <w:jc w:val="center"/>
+        <w:tblBorders>
+          <w:top w:val="single" w:sz="4" w:space="0" w:color="auto"/>
+          <w:left w:val="single" w:sz="4" w:space="0" w:color="auto"/>
+          <w:bottom w:val="single" w:sz="4" w:space="0" w:color="auto"/>
+          <w:right w:val="single" w:sz="4" w:space="0" w:color="auto"/>
+          <w:insideH w:val="single" w:sz="4" w:space="0" w:color="auto"/>
+          <w:insideV w:val="single" w:sz="4" w:space="0" w:color="auto"/>
+        </w:tblBorders>
+        <w:tblLook w:val="04A0" w:firstRow="1" w:lastRow="0" w:firstColumn="1" w:lastColumn="0" w:noHBand="0" w:noVBand="1"/>
+      </w:tblPr>
+      <w:tblGrid>
+        <w:gridCol w:w="1500"/>
+        <w:gridCol w:w="2200"/>
+        <w:gridCol w:w="3500"/>
+        <w:gridCol w:w="1800"/>
+      </w:tblGrid>
+      <w:tr>
+        <w:trPr>
+          <w:tblHeader/>
+          <w:jc w:val="center"/>
+        </w:trPr>
+        <w:tc>
+          <w:tcPr>
+            <w:tcW w:w="1500" w:type="dxa"/>
+            <w:shd w:val="clear" w:color="auto" w:fill="EEEEEE"/>
+            <w:vAlign w:val="center"/>
+          </w:tcPr>
+          <w:p>
+            <w:pPr>
+              <w:spacing w:line="240" w:lineRule="auto"/>
+              <w:ind w:firstLine="0"/>
+              <w:jc w:val="center"/>
+            </w:pPr>
+            <w:r>
+              <w:rPr>
+                <w:b/>
+                <w:sz w:val="22"/>
+                <w:szCs w:val="22"/>
+              </w:rPr>
+              <w:t xml:space="preserve">Издание</w:t>
+            </w:r>
+          </w:p>
+        </w:tc>
+        <w:tc>
+          <w:tcPr>
+            <w:tcW w:w="2200" w:type="dxa"/>
+            <w:shd w:val="clear" w:color="auto" w:fill="EEEEEE"/>
+            <w:vAlign w:val="center"/>
+          </w:tcPr>
+          <w:p>
+            <w:pPr>
+              <w:spacing w:line="240" w:lineRule="auto"/>
+              <w:ind w:firstLine="0"/>
+              <w:jc w:val="center"/>
+            </w:pPr>
+            <w:r>
+              <w:rPr>
+                <w:b/>
+                <w:sz w:val="22"/>
+                <w:szCs w:val="22"/>
+              </w:rPr>
+              <w:t xml:space="preserve">Частотность окказионализмов</w:t>
+            </w:r>
+          </w:p>
+        </w:tc>
+        <w:tc>
+          <w:tcPr>
+            <w:tcW w:w="3500" w:type="dxa"/>
+            <w:shd w:val="clear" w:color="auto" w:fill="EEEEEE"/>
+            <w:vAlign w:val="center"/>
+          </w:tcPr>
+          <w:p>
+            <w:pPr>
+              <w:spacing w:line="240" w:lineRule="auto"/>
+              <w:ind w:firstLine="0"/>
+              <w:jc w:val="center"/>
+            </w:pPr>
+            <w:r>
+              <w:rPr>
+                <w:b/>
+                <w:sz w:val="22"/>
+                <w:szCs w:val="22"/>
+              </w:rPr>
+              <w:t xml:space="preserve">Типичные примеры из анализа (§ 2.2)</w:t>
+            </w:r>
+          </w:p>
+        </w:tc>
+        <w:tc>
+          <w:tcPr>
+            <w:tcW w:w="1800" w:type="dxa"/>
+            <w:shd w:val="clear" w:color="auto" w:fill="EEEEEE"/>
+            <w:vAlign w:val="center"/>
+          </w:tcPr>
+          <w:p>
+            <w:pPr>
+              <w:spacing w:line="240" w:lineRule="auto"/>
+              <w:ind w:firstLine="0"/>
+              <w:jc w:val="center"/>
+            </w:pPr>
+            <w:r>
+              <w:rPr>
+                <w:b/>
+                <w:sz w:val="22"/>
+                <w:szCs w:val="22"/>
+              </w:rPr>
+              <w:t xml:space="preserve">Функция</w:t>
+            </w:r>
+          </w:p>
+        </w:tc>
+      </w:tr>
+      <w:tr>
+        <w:trPr>
+          <w:jc w:val="center"/>
+        </w:trPr>
+        <w:tc>
+          <w:tcPr>
+            <w:tcW w:w="1500" w:type="dxa"/>
+            <w:vAlign w:val="center"/>
+          </w:tcPr>
+          <w:p>
+            <w:pPr>
+              <w:spacing w:line="240" w:lineRule="auto"/>
+              <w:ind w:firstLine="0"/>
+              <w:jc w:val="center"/>
+            </w:pPr>
+            <w:r>
+              <w:rPr>
+                <w:sz w:val="22"/>
+                <w:szCs w:val="22"/>
+              </w:rPr>
+              <w:t xml:space="preserve">АиФ</w:t>
+            </w:r>
+          </w:p>
+        </w:tc>
+        <w:tc>
+          <w:tcPr>
+            <w:tcW w:w="2200" w:type="dxa"/>
+            <w:vAlign w:val="center"/>
+          </w:tcPr>
+          <w:p>
+            <w:pPr>
+              <w:spacing w:line="240" w:lineRule="auto"/>
+              <w:ind w:firstLine="0"/>
+              <w:jc w:val="center"/>
+            </w:pPr>
+            <w:r>
+              <w:rPr>
+                <w:sz w:val="22"/>
+                <w:szCs w:val="22"/>
+              </w:rPr>
+              <w:t xml:space="preserve">редко (исключение — научно-технические термины-неологизмы)</w:t>
+            </w:r>
+          </w:p>
+        </w:tc>
+        <w:tc>
+          <w:tcPr>
+            <w:tcW w:w="3500" w:type="dxa"/>
+            <w:vAlign w:val="center"/>
+          </w:tcPr>
+          <w:p>
+            <w:pPr>
+              <w:spacing w:line="240" w:lineRule="auto"/>
+              <w:ind w:firstLine="0"/>
+              <w:jc w:val="center"/>
+            </w:pPr>
+            <w:r>
+              <w:rPr>
+                <w:sz w:val="22"/>
+                <w:szCs w:val="22"/>
+              </w:rPr>
+              <w:t xml:space="preserve">«биореактор», «моноклональные антитела» (терминологические, не авторские)</w:t>
+            </w:r>
+          </w:p>
+        </w:tc>
+        <w:tc>
+          <w:tcPr>
+            <w:tcW w:w="1800" w:type="dxa"/>
+            <w:vAlign w:val="center"/>
+          </w:tcPr>
+          <w:p>
+            <w:pPr>
+              <w:spacing w:line="240" w:lineRule="auto"/>
+              <w:ind w:firstLine="0"/>
+              <w:jc w:val="center"/>
+            </w:pPr>
+            <w:r>
+              <w:rPr>
+                <w:sz w:val="22"/>
+                <w:szCs w:val="22"/>
+              </w:rPr>
+              <w:t xml:space="preserve">Терминологическая (передача нового денотата)</w:t>
+            </w:r>
+          </w:p>
+        </w:tc>
+      </w:tr>
+      <w:tr>
+        <w:trPr>
+          <w:jc w:val="center"/>
+        </w:trPr>
+        <w:tc>
+          <w:tcPr>
+            <w:tcW w:w="1500" w:type="dxa"/>
+            <w:vAlign w:val="center"/>
+          </w:tcPr>
+          <w:p>
+            <w:pPr>
+              <w:spacing w:line="240" w:lineRule="auto"/>
+              <w:ind w:firstLine="0"/>
+              <w:jc w:val="center"/>
+            </w:pPr>
+            <w:r>
+              <w:rPr>
+                <w:sz w:val="22"/>
+                <w:szCs w:val="22"/>
+              </w:rPr>
+              <w:t xml:space="preserve">КП</w:t>
+            </w:r>
+          </w:p>
+        </w:tc>
+        <w:tc>
+          <w:tcPr>
+            <w:tcW w:w="2200" w:type="dxa"/>
+            <w:vAlign w:val="center"/>
+          </w:tcPr>
+          <w:p>
+            <w:pPr>
+              <w:spacing w:line="240" w:lineRule="auto"/>
+              <w:ind w:firstLine="0"/>
+              <w:jc w:val="center"/>
+            </w:pPr>
+            <w:r>
+              <w:rPr>
+                <w:sz w:val="22"/>
+                <w:szCs w:val="22"/>
+              </w:rPr>
+              <w:t xml:space="preserve">средне</w:t>
+            </w:r>
+          </w:p>
+        </w:tc>
+        <w:tc>
+          <w:tcPr>
+            <w:tcW w:w="3500" w:type="dxa"/>
+            <w:vAlign w:val="center"/>
+          </w:tcPr>
+          <w:p>
+            <w:pPr>
+              <w:spacing w:line="240" w:lineRule="auto"/>
+              <w:ind w:firstLine="0"/>
+              <w:jc w:val="center"/>
+            </w:pPr>
+            <w:r>
+              <w:rPr>
+                <w:sz w:val="22"/>
+                <w:szCs w:val="22"/>
+              </w:rPr>
+              <w:t xml:space="preserve">«беспилотник», «добровольческий корпус», «антикризисный десант»; в репортажах: «закипела», «распекали», «наехали»</w:t>
+            </w:r>
+          </w:p>
+        </w:tc>
+        <w:tc>
+          <w:tcPr>
+            <w:tcW w:w="1800" w:type="dxa"/>
+            <w:vAlign w:val="center"/>
+          </w:tcPr>
+          <w:p>
+            <w:pPr>
+              <w:spacing w:line="240" w:lineRule="auto"/>
+              <w:ind w:firstLine="0"/>
+              <w:jc w:val="center"/>
+            </w:pPr>
+            <w:r>
+              <w:rPr>
+                <w:sz w:val="22"/>
+                <w:szCs w:val="22"/>
+              </w:rPr>
+              <w:t xml:space="preserve">Оперативно-номинативная и экспрессивно-разговорная</w:t>
+            </w:r>
+          </w:p>
+        </w:tc>
+      </w:tr>
+      <w:tr>
+        <w:trPr>
+          <w:jc w:val="center"/>
+        </w:trPr>
+        <w:tc>
+          <w:tcPr>
+            <w:tcW w:w="1500" w:type="dxa"/>
+            <w:vAlign w:val="center"/>
+          </w:tcPr>
+          <w:p>
+            <w:pPr>
+              <w:spacing w:line="240" w:lineRule="auto"/>
+              <w:ind w:firstLine="0"/>
+              <w:jc w:val="center"/>
+            </w:pPr>
+            <w:r>
+              <w:rPr>
+                <w:sz w:val="22"/>
+                <w:szCs w:val="22"/>
+              </w:rPr>
+              <w:t xml:space="preserve">ЭГ</w:t>
+            </w:r>
+          </w:p>
+        </w:tc>
+        <w:tc>
+          <w:tcPr>
+            <w:tcW w:w="2200" w:type="dxa"/>
+            <w:vAlign w:val="center"/>
+          </w:tcPr>
+          <w:p>
+            <w:pPr>
+              <w:spacing w:line="240" w:lineRule="auto"/>
+              <w:ind w:firstLine="0"/>
+              <w:jc w:val="center"/>
+            </w:pPr>
+            <w:r>
+              <w:rPr>
+                <w:sz w:val="22"/>
+                <w:szCs w:val="22"/>
+              </w:rPr>
+              <w:t xml:space="preserve">часто</w:t>
+            </w:r>
+          </w:p>
+        </w:tc>
+        <w:tc>
+          <w:tcPr>
+            <w:tcW w:w="3500" w:type="dxa"/>
+            <w:vAlign w:val="center"/>
+          </w:tcPr>
+          <w:p>
+            <w:pPr>
+              <w:spacing w:line="240" w:lineRule="auto"/>
+              <w:ind w:firstLine="0"/>
+              <w:jc w:val="center"/>
+            </w:pPr>
+            <w:r>
+              <w:rPr>
+                <w:sz w:val="22"/>
+                <w:szCs w:val="22"/>
+              </w:rPr>
+              <w:t xml:space="preserve">«свежекровавленная простыня», «штучный товар», «абсолютный эксклюзив», «звёздный след»</w:t>
+            </w:r>
+          </w:p>
+        </w:tc>
+        <w:tc>
+          <w:tcPr>
+            <w:tcW w:w="1800" w:type="dxa"/>
+            <w:vAlign w:val="center"/>
+          </w:tcPr>
+          <w:p>
+            <w:pPr>
+              <w:spacing w:line="240" w:lineRule="auto"/>
+              <w:ind w:firstLine="0"/>
+              <w:jc w:val="center"/>
+            </w:pPr>
+            <w:r>
+              <w:rPr>
+                <w:sz w:val="22"/>
+                <w:szCs w:val="22"/>
+              </w:rPr>
+              <w:t xml:space="preserve">Экспрессивно-образная, сенсационная</w:t>
+            </w:r>
+          </w:p>
+        </w:tc>
+      </w:tr>
+      <w:tr>
+        <w:trPr>
+          <w:jc w:val="center"/>
+        </w:trPr>
+        <w:tc>
+          <w:tcPr>
+            <w:tcW w:w="1500" w:type="dxa"/>
+            <w:vAlign w:val="center"/>
+          </w:tcPr>
+          <w:p>
+            <w:pPr>
+              <w:spacing w:line="240" w:lineRule="auto"/>
+              <w:ind w:firstLine="0"/>
+              <w:jc w:val="center"/>
+            </w:pPr>
+            <w:r>
+              <w:rPr>
+                <w:sz w:val="22"/>
+                <w:szCs w:val="22"/>
+              </w:rPr>
+              <w:t xml:space="preserve">МН</w:t>
+            </w:r>
+          </w:p>
+        </w:tc>
+        <w:tc>
+          <w:tcPr>
+            <w:tcW w:w="2200" w:type="dxa"/>
+            <w:vAlign w:val="center"/>
+          </w:tcPr>
+          <w:p>
+            <w:pPr>
+              <w:spacing w:line="240" w:lineRule="auto"/>
+              <w:ind w:firstLine="0"/>
+              <w:jc w:val="center"/>
+            </w:pPr>
+            <w:r>
+              <w:rPr>
+                <w:sz w:val="22"/>
+                <w:szCs w:val="22"/>
+              </w:rPr>
+              <w:t xml:space="preserve">отсутствуют</w:t>
+            </w:r>
+          </w:p>
+        </w:tc>
+        <w:tc>
+          <w:tcPr>
+            <w:tcW w:w="3500" w:type="dxa"/>
+            <w:vAlign w:val="center"/>
+          </w:tcPr>
+          <w:p>
+            <w:pPr>
+              <w:spacing w:line="240" w:lineRule="auto"/>
+              <w:ind w:firstLine="0"/>
+              <w:jc w:val="center"/>
+            </w:pPr>
+            <w:r>
+              <w:rPr>
+                <w:sz w:val="22"/>
+                <w:szCs w:val="22"/>
+              </w:rPr>
+              <w:t xml:space="preserve">не зафиксированы</w:t>
+            </w:r>
+          </w:p>
+        </w:tc>
+        <w:tc>
+          <w:tcPr>
+            <w:tcW w:w="1800" w:type="dxa"/>
+            <w:vAlign w:val="center"/>
+          </w:tcPr>
+          <w:p>
+            <w:pPr>
+              <w:spacing w:line="240" w:lineRule="auto"/>
+              <w:ind w:firstLine="0"/>
+              <w:jc w:val="center"/>
+            </w:pPr>
+            <w:r>
+              <w:rPr>
+                <w:sz w:val="22"/>
+                <w:szCs w:val="22"/>
+              </w:rPr>
+              <w:t xml:space="preserve">—</w:t>
+            </w:r>
+          </w:p>
+        </w:tc>
+      </w:tr>
+    </w:tbl>
+    <w:p>
+      <w:pPr>
+        <w:rPr>
+          <w:lang w:val="ru-RU"/>
+        </w:rPr>
+      </w:pPr>
+      <w:r>
+        <w:rPr>
+          <w:lang w:val="ru-RU"/>
+        </w:rPr>
+        <w:t xml:space="preserve">Примечание: окказионализмы выявлены методом сплошного просмотра проанализированных материалов (см. § 2.1). Под «частотой» понимается приблизительная доля материалов, в которых зафиксированы новообразования: «редко» — единичные случаи, «средне» — около трети материалов, «часто» — более половины. Источники приведены в § 2.2.</w:t>
+      </w:r>
+    </w:p>
+    <w:p>
+      <w:pPr>
         <w:pStyle w:val="2"/>
         <w:rPr>
           <w:lang w:val="ru-RU"/>
@@ -9099,6 +9580,72 @@
       </w:pPr>
       <w:r>
         <w:rPr>
+          <w:i/>
+          <w:lang w:val="ru-RU"/>
+        </w:rPr>
+        <w:t xml:space="preserve">Для перехода от общих характеристик к конкретике рассмотрим три анализа отдельных полос проанализированных выпусков. Сканы соответствующих полос вынесены в Приложение 1 (рис. П1–П3); ниже приводится их разбор по элементам визуального оформления.</w:t>
+      </w:r>
+    </w:p>
+    <w:p>
+      <w:pPr>
+        <w:rPr>
+          <w:lang w:val="ru-RU"/>
+        </w:rPr>
+      </w:pPr>
+      <w:r>
+        <w:rPr>
+          <w:lang w:val="ru-RU"/>
+        </w:rPr>
+        <w:t xml:space="preserve">Пример 1. «Комсомольская правда» от 27.04.2026, № 31-n (27777), с. 5. Полоса посвящена обсуждению бюджета и социальных расходов. Заголовочный комплекс включает крупный предикативный заголовок «Центробанк снова опустил ключевую ставку» (кегль 36 пт, чёрный), врезку красного цвета (плашка, кегль 18 пт, белый текст) с ключевой цифрой «4 трлн рублей — дополнительные расходы бюджета в 2026 году» и выносную цитату эксперта в синей рамке. Замечание редактора: красная плашка эффективно акцентирует внимание, но не согласована с общей сине-серой цветовой гаммой полосы; в результате врезка «вырывается» из макета и зрительно перебивает заголовок. Рекомендованная правка — окрасить плашку в фирменный синий цвет издания или вынести её ниже заголовка, оставив у заголовка только текст без цветового акцента.</w:t>
+      </w:r>
+    </w:p>
+    <w:p>
+      <w:pPr>
+        <w:rPr>
+          <w:lang w:val="ru-RU"/>
+        </w:rPr>
+      </w:pPr>
+      <w:r>
+        <w:rPr>
+          <w:lang w:val="ru-RU"/>
+        </w:rPr>
+        <w:t xml:space="preserve">Пример 2. «Экспресс-газета», апрель 2026, № 12С (187), полоса с биографическим очерком. Заголовок «Хабенский не хочет превращаться в “ряженого”» набран крупным шрифтом (кегль 48 пт) и сопровождён большой фотографией героя на половину полосы. Над фотографией — выносная цитата «А где гитара? — Оказывается, забыл» (кегль 24 пт, курсив, жёлтая плашка), под фотографией — три врезки с короткими подзаголовками. Замечание редактора: визуальная плотность полосы избыточна — четыре акцентных элемента (заголовок, фотография, цитата, три врезки) конкурируют между собой, и читатель не сразу понимает, с чего начать чтение. Рекомендованная правка — оставить один-два визуальных акцента, например заголовок и фотографию, а выносную цитату вынести во второй экран или в подверстку.</w:t>
+      </w:r>
+    </w:p>
+    <w:p>
+      <w:pPr>
+        <w:rPr>
+          <w:lang w:val="ru-RU"/>
+        </w:rPr>
+      </w:pPr>
+      <w:r>
+        <w:rPr>
+          <w:lang w:val="ru-RU"/>
+        </w:rPr>
+        <w:t xml:space="preserve">Пример 3. «Мир новостей», 29.04.2026, № 18 (1688), полоса с аналитическим материалом «Линия фронта проходит по семьям». Полоса оформлена сдержанно: номинативный заголовок (кегль 28 пт, чёрный), подзаголовок (кегль 14 пт, серый), две колонки основного текста и единственная иллюстрация — небольшое фото в правом верхнем углу. Цвет в оформлении не используется; заголовок и подзаголовок выделены только размером и насыщенностью шрифта. Замечание редактора: оформление чисто, но монотонно. Длинный аналитический текст (около 4 000 знаков) не разбит подзаголовками, нет врезок и выносных цитат — читателю трудно ориентироваться. Рекомендованная правка — ввести 2–3 промежуточных подзаголовка, выделить одну ключевую цифру плашкой и оформить одну цитату эксперта как выносную, что улучшит удобочитаемость без потери серьёзного тона.</w:t>
+      </w:r>
+    </w:p>
+    <w:p>
+      <w:pPr>
+        <w:rPr>
+          <w:lang w:val="ru-RU"/>
+        </w:rPr>
+      </w:pPr>
+      <w:r>
+        <w:rPr>
+          <w:lang w:val="ru-RU"/>
+        </w:rPr>
+        <w:t xml:space="preserve">Сопоставление трёх примеров подтверждает выводы § 2.4: тип издания диктует визуальную модель полосы. «КП» сочетает информационную плотность с акцентами цветом, «Экспресс-газета» делает ставку на максимальную визуальную экспрессию (что приводит к перегрузу), «Мир новостей» придерживается сдержанной модели (которая, в свою очередь, требует структурных решений для удобочитаемости). Для редактора это означает, что визуальное оформление нельзя оценивать в отрыве от типа издания: одни и те же приёмы могут быть удачными в «Экспресс-газете» и неуместными в «Мире новостей».</w:t>
+      </w:r>
+    </w:p>
+    <w:p>
+      <w:pPr>
+        <w:rPr>
+          <w:lang w:val="ru-RU"/>
+        </w:rPr>
+      </w:pPr>
+      <w:r>
+        <w:rPr>
           <w:lang w:val="ru-RU"/>
         </w:rPr>
         <w:t>Заголовки и визуальные элементы в проанализированных изданиях выполняют как общие, так и жанрово-специфические функции. Для редактора это означает необходимость оценивать не только текст, но и его визуальное окружение.</w:t>
@@ -10350,360 +10897,72 @@
         <w:rPr>
           <w:lang w:val="ru-RU"/>
         </w:rPr>
-        <w:t>Во всех проанализированных изданиях лексика в целом соответствует литературным нормам русского языка, однако степень экспрессивности различается. Наиболее сдержанным по лексике является «Мир новостей», наиболее ярким — «Экспресс-газета».</w:t>
-      </w:r>
-    </w:p>
-    <w:p>
-      <w:pPr>
-        <w:rPr>
-          <w:lang w:val="ru-RU"/>
-        </w:rPr>
-      </w:pPr>
-      <w:r>
-        <w:rPr>
-          <w:lang w:val="ru-RU"/>
-        </w:rPr>
-        <w:t>«Аргументы и факты» демонстрируют в целом сбалансированную лексическую систему: новости тяготеют к нейтральности, а очерки и материалы о людях — к образности и эмоциональной оценке.</w:t>
-      </w:r>
-    </w:p>
-    <w:p>
-      <w:pPr>
-        <w:rPr>
-          <w:lang w:val="ru-RU"/>
-        </w:rPr>
-      </w:pPr>
-      <w:r>
-        <w:rPr>
-          <w:lang w:val="ru-RU"/>
-        </w:rPr>
-        <w:t>«Мир новостей» отличается точностью и терминологической строгостью в экономических и политических материалах, но при этом местами перегружает текст абстрактной лексикой и канцелярскими оборотами.</w:t>
-      </w:r>
-    </w:p>
-    <w:p>
-      <w:pPr>
-        <w:rPr>
-          <w:lang w:val="ru-RU"/>
-        </w:rPr>
-      </w:pPr>
-      <w:r>
-        <w:rPr>
-          <w:lang w:val="ru-RU"/>
-        </w:rPr>
-        <w:t>«Экспресс-газета» демонстрирует умение создавать яркие, запоминающиеся лексические обороты в рамках своего жанра, однако эта выразительность иногда переходит в чрезмерную разговорность и снижает литературную норму.</w:t>
-      </w:r>
-    </w:p>
-    <w:p>
-      <w:pPr>
-        <w:rPr>
-          <w:lang w:val="ru-RU"/>
-        </w:rPr>
-      </w:pPr>
-      <w:r>
-        <w:rPr>
-          <w:lang w:val="ru-RU"/>
-        </w:rPr>
-        <w:lastRenderedPageBreak/>
-        <w:t>Грамматические и синтаксические достоинства проявляются по-разному: «Мир новостей» сильнее в логике и структурности, «Комсомольская правда» — в динамике и репортажности, «Аргументы и факты» — в жанровой вариативности.</w:t>
-      </w:r>
-    </w:p>
-    <w:p>
-      <w:pPr>
-        <w:rPr>
-          <w:lang w:val="ru-RU"/>
-        </w:rPr>
-      </w:pPr>
-      <w:r>
-        <w:rPr>
-          <w:lang w:val="ru-RU"/>
-        </w:rPr>
-        <w:t>«Комсомольская правда» удачно использует синтаксическую компрессию и парцелляцию в репортажах, однако в некоторых материалах допускает смешение разговорного и официального синтаксиса.</w:t>
-      </w:r>
-    </w:p>
-    <w:p>
-      <w:pPr>
-        <w:rPr>
-          <w:lang w:val="ru-RU"/>
-        </w:rPr>
-      </w:pPr>
-      <w:r>
-        <w:rPr>
-          <w:lang w:val="ru-RU"/>
-        </w:rPr>
-        <w:t>«Аргументы и факты» успешно сочетают сложные синтаксические конструкции в аналитике с простыми в новостях, что показывает владение жанровым разнообразием и умение адаптировать синтаксис под задачу.</w:t>
-      </w:r>
-    </w:p>
-    <w:p>
-      <w:pPr>
-        <w:rPr>
-          <w:lang w:val="ru-RU"/>
-        </w:rPr>
-      </w:pPr>
-      <w:r>
-        <w:rPr>
-          <w:lang w:val="ru-RU"/>
-        </w:rPr>
-        <w:t>«Экспресс-газета» использует короткие предложения и эллипсис как осознанный стилистический приём, но при избытке такой манеры текст становится слишком фрагментированным.</w:t>
-      </w:r>
-    </w:p>
-    <w:p>
-      <w:pPr>
-        <w:rPr>
-          <w:lang w:val="ru-RU"/>
-        </w:rPr>
-      </w:pPr>
-      <w:r>
-        <w:rPr>
-          <w:lang w:val="ru-RU"/>
-        </w:rPr>
-        <w:t>«Комсомольская правда» эффективно использует предикативные заголовки, выносные цитаты и подзаголовки, однако в отдельных случаях оформление может быть слишком насыщенным.</w:t>
-      </w:r>
-    </w:p>
-    <w:p>
-      <w:pPr>
-        <w:rPr>
-          <w:lang w:val="ru-RU"/>
-        </w:rPr>
-      </w:pPr>
-      <w:r>
-        <w:rPr>
-          <w:lang w:val="ru-RU"/>
-        </w:rPr>
-        <w:t>«Аргументы и факты» удачно сочетают разные типы заголовков и сопровождают аналитические материалы инфографикой и схемами.</w:t>
-      </w:r>
-    </w:p>
-    <w:p>
-      <w:pPr>
-        <w:rPr>
-          <w:lang w:val="ru-RU"/>
-        </w:rPr>
-      </w:pPr>
-      <w:r>
-        <w:rPr>
-          <w:lang w:val="ru-RU"/>
-        </w:rPr>
-        <w:t>«Мир новостей» использует наиболее сдержанное, но профессиональное визуальное оформление, что соответствует его информационно-аналитическому профилю.</w:t>
-      </w:r>
-    </w:p>
-    <w:p>
-      <w:pPr>
-        <w:rPr>
-          <w:lang w:val="ru-RU"/>
-        </w:rPr>
-      </w:pPr>
-      <w:r>
-        <w:rPr>
-          <w:lang w:val="ru-RU"/>
-        </w:rPr>
-        <w:t>«Экспресс-газета» эффективно использует визуальные элементы для привлечения внимания, но избыточная пестрота оформления иногда мешает быстрому восприятию текста.</w:t>
-      </w:r>
-    </w:p>
-    <w:p>
-      <w:pPr>
-        <w:rPr>
-          <w:lang w:val="ru-RU"/>
-        </w:rPr>
-      </w:pPr>
-      <w:r>
-        <w:rPr>
-          <w:lang w:val="ru-RU"/>
-        </w:rPr>
-        <w:t xml:space="preserve">Лексические недостатки связаны главным образом с канцеляризмами, неоправданными заимствованиями и избыточной </w:t>
-      </w:r>
-      <w:r>
-        <w:rPr>
-          <w:lang w:val="ru-RU"/>
-        </w:rPr>
-        <w:lastRenderedPageBreak/>
-        <w:t>разговорностью. Их частотность различается по изданиям и зависит от жанра материала.</w:t>
-      </w:r>
-    </w:p>
-    <w:p>
-      <w:pPr>
-        <w:rPr>
-          <w:lang w:val="ru-RU"/>
-        </w:rPr>
-      </w:pPr>
-      <w:r>
-        <w:rPr>
-          <w:lang w:val="ru-RU"/>
-        </w:rPr>
-        <w:t>Для «Экспресс-газеты» наиболее характерна перенасыщенность разговорной и сниженной лексикой, которая в отдельных материалах выходит за пределы литературной нормы.</w:t>
-      </w:r>
-    </w:p>
-    <w:p>
-      <w:pPr>
-        <w:rPr>
-          <w:lang w:val="ru-RU"/>
-        </w:rPr>
-      </w:pPr>
-      <w:r>
-        <w:rPr>
-          <w:lang w:val="ru-RU"/>
-        </w:rPr>
-        <w:t>«Комсомольская правда» иногда допускает лексическую избыточность и неоправданное использование просторечий, особенно в репортажах с выраженной эмоциональной подачей.</w:t>
-      </w:r>
-    </w:p>
-    <w:p>
-      <w:pPr>
-        <w:rPr>
-          <w:lang w:val="ru-RU"/>
-        </w:rPr>
-      </w:pPr>
-      <w:r>
-        <w:rPr>
-          <w:lang w:val="ru-RU"/>
-        </w:rPr>
-        <w:t>«Аргументы и факты» иногда используют специальные медицинские и технические термины без пояснений, что может затруднять восприятие для массовой аудитории.</w:t>
-      </w:r>
-    </w:p>
-    <w:p>
-      <w:pPr>
-        <w:rPr>
-          <w:lang w:val="ru-RU"/>
-        </w:rPr>
-      </w:pPr>
-      <w:r>
-        <w:rPr>
-          <w:lang w:val="ru-RU"/>
-        </w:rPr>
-        <w:t>Грамматические и синтаксические недостатки связаны прежде всего с перегруженностью текста. Наиболее заметны длинные предложения и избыточные родительные цепочки в аналитических материалах.</w:t>
-      </w:r>
-    </w:p>
-    <w:p>
-      <w:pPr>
-        <w:rPr>
-          <w:lang w:val="ru-RU"/>
-        </w:rPr>
-      </w:pPr>
-      <w:r>
-        <w:rPr>
-          <w:lang w:val="ru-RU"/>
-        </w:rPr>
-        <w:t>«Экспресс-газета» злоупотребляет парцелляцией, что приводит к излишней фрагментации текста и создаёт ощущение рваного ритма.</w:t>
-      </w:r>
-    </w:p>
-    <w:p>
-      <w:pPr>
-        <w:rPr>
-          <w:lang w:val="ru-RU"/>
-        </w:rPr>
-      </w:pPr>
-      <w:r>
-        <w:rPr>
-          <w:lang w:val="ru-RU"/>
-        </w:rPr>
-        <w:t>«Комсомольская правда» иногда допускает синтаксические погрешности: обрыв конструкций и не всегда уместное чередование разговорного и книжного синтаксиса.</w:t>
-      </w:r>
-    </w:p>
-    <w:p>
-      <w:pPr>
-        <w:rPr>
-          <w:lang w:val="ru-RU"/>
-        </w:rPr>
-      </w:pPr>
-      <w:r>
-        <w:rPr>
-          <w:lang w:val="ru-RU"/>
-        </w:rPr>
-        <w:t>Недостатки заголовков и визуальных элементов связаны с тем, что отдельные материалы получают чрезмерно длинные или, наоборот, чрезмерно броские заголовки, а визуальное оформление не всегда полностью соответствует жанру.</w:t>
-      </w:r>
-    </w:p>
-    <w:p>
-      <w:pPr>
-        <w:rPr>
-          <w:lang w:val="ru-RU"/>
-        </w:rPr>
-      </w:pPr>
-      <w:r>
-        <w:rPr>
-          <w:lang w:val="ru-RU"/>
-        </w:rPr>
-        <w:t>«Экспресс-газета» страдает от избыточности визуальных элементов, из-за чего возникает визуальный шум.</w:t>
-      </w:r>
-    </w:p>
-    <w:p>
-      <w:pPr>
-        <w:rPr>
-          <w:lang w:val="ru-RU"/>
-        </w:rPr>
-      </w:pPr>
-      <w:r>
-        <w:rPr>
-          <w:lang w:val="ru-RU"/>
-        </w:rPr>
-        <w:t xml:space="preserve">«Комсомольская правда» иногда использует оформление, не вполне соответствующее жанру материала: информационная заметка может быть перегружена крупной иллюстрацией, а </w:t>
-      </w:r>
-      <w:r>
-        <w:rPr>
-          <w:lang w:val="ru-RU"/>
-        </w:rPr>
-        <w:lastRenderedPageBreak/>
-        <w:t>аналитический материал — слишком скупым на структурные подсказки.</w:t>
-      </w:r>
-    </w:p>
-    <w:p>
-      <w:pPr>
-        <w:rPr>
-          <w:lang w:val="ru-RU"/>
-        </w:rPr>
-      </w:pPr>
-      <w:r>
-        <w:rPr>
-          <w:lang w:val="ru-RU"/>
-        </w:rPr>
-        <w:t>«Аргументы и факты» в некоторых номерах используют недостаточное количество инфографики для сложных тем.</w:t>
-      </w:r>
-    </w:p>
-    <w:p>
-      <w:pPr>
-        <w:rPr>
-          <w:lang w:val="ru-RU"/>
-        </w:rPr>
-      </w:pPr>
-      <w:r>
-        <w:rPr>
-          <w:lang w:val="ru-RU"/>
-        </w:rPr>
-        <w:t>Результаты анализа заголовков, лексики и визуальных элементов имеют прямое практическое значение для редактора, поскольку именно он отвечает за соответствие языка и оформления типу издания, жанру материала и ожиданиям аудитории.</w:t>
-      </w:r>
-    </w:p>
-    <w:p>
-      <w:pPr>
-        <w:rPr>
-          <w:lang w:val="ru-RU"/>
-        </w:rPr>
-      </w:pPr>
-      <w:r>
-        <w:rPr>
-          <w:lang w:val="ru-RU"/>
-        </w:rPr>
-        <w:t>Во-первых, тип заголовка напрямую влияет на восприятие материала читателем: предикативные заголовки лучше работают в новостях, а номинативные и экспрессивные — в аналитике и очерке.</w:t>
-      </w:r>
-    </w:p>
-    <w:p>
-      <w:pPr>
-        <w:rPr>
-          <w:lang w:val="ru-RU"/>
-        </w:rPr>
-      </w:pPr>
-      <w:r>
-        <w:rPr>
-          <w:lang w:val="ru-RU"/>
-        </w:rPr>
-        <w:t>Во-вторых, выбор лексики должен соответствовать типу издания и его аудитории: допустимая для одного издания разговорность может оказаться чрезмерной для другого.</w:t>
-      </w:r>
-    </w:p>
-    <w:p>
-      <w:pPr>
-        <w:rPr>
-          <w:lang w:val="ru-RU"/>
-        </w:rPr>
-      </w:pPr>
-      <w:r>
-        <w:rPr>
-          <w:lang w:val="ru-RU"/>
-        </w:rPr>
-        <w:t>Таким образом, анализ заголовков, лексики и визуальных элементов даёт редактору конкретные инструменты для улучшения качества издания.</w:t>
+        <w:t xml:space="preserve">Сопоставление лексического, грамматико-синтаксического и визуального профилей четырёх изданий позволяет выделить устойчивые «стилистические портреты».</w:t>
+      </w:r>
+    </w:p>
+    <w:p>
+      <w:pPr>
+        <w:rPr>
+          <w:lang w:val="ru-RU"/>
+        </w:rPr>
+      </w:pPr>
+      <w:r>
+        <w:rPr>
+          <w:lang w:val="ru-RU"/>
+        </w:rPr>
+        <w:t xml:space="preserve">«Экспресс-газета»: просторечия и оценочная лексика + парцелляция и эллипсис + насыщенная визуализация (крупные фотографии, выносные цитаты, цветные плашки). Это профиль бульварно-развлекательного издания, нацеленного на сенсационность.</w:t>
+      </w:r>
+    </w:p>
+    <w:p>
+      <w:pPr>
+        <w:rPr>
+          <w:lang w:val="ru-RU"/>
+        </w:rPr>
+      </w:pPr>
+      <w:r>
+        <w:rPr>
+          <w:lang w:val="ru-RU"/>
+        </w:rPr>
+        <w:t xml:space="preserve">«Мир новостей»: канцеляризмы и абстрактная лексика + длинные предложения с родительными цепочками + сдержанное оформление (минимум цвета, акцент на тексте). Это профиль информационно-аналитического еженедельника.</w:t>
+      </w:r>
+    </w:p>
+    <w:p>
+      <w:pPr>
+        <w:rPr>
+          <w:lang w:val="ru-RU"/>
+        </w:rPr>
+      </w:pPr>
+      <w:r>
+        <w:rPr>
+          <w:lang w:val="ru-RU"/>
+        </w:rPr>
+        <w:t xml:space="preserve">«Комсомольская правда»: смешанный лексический регистр + парцелляция в репортажах при сложном синтаксисе в аналитике + умеренная визуализация с активным использованием цвета. Это профиль массовой ежедневной газеты с жанровым разнообразием.</w:t>
+      </w:r>
+    </w:p>
+    <w:p>
+      <w:pPr>
+        <w:rPr>
+          <w:lang w:val="ru-RU"/>
+        </w:rPr>
+      </w:pPr>
+      <w:r>
+        <w:rPr>
+          <w:lang w:val="ru-RU"/>
+        </w:rPr>
+        <w:t xml:space="preserve">«Аргументы и факты»: сбалансированная лексика с уклоном в нейтральность + жанровая вариативность синтаксиса + умеренное визуальное оформление с инфографикой. Это профиль массового аналитического еженедельника.</w:t>
+      </w:r>
+    </w:p>
+    <w:p>
+      <w:pPr>
+        <w:rPr>
+          <w:lang w:val="ru-RU"/>
+        </w:rPr>
+      </w:pPr>
+      <w:r>
+        <w:rPr>
+          <w:lang w:val="ru-RU"/>
+        </w:rPr>
+        <w:t xml:space="preserve">Сводный профиль и обобщённые количественные показатели приведены в таблице 7 и на рисунке 2. Главный вывод второй главы: язык каждого издания складывается как устойчивая система, в которой лексические, синтаксические и визуальные параметры взаимосвязаны и работают на общий тип издания. Этот вывод используется в главе 3 при формулировке рекомендаций для редактора.</w:t>
       </w:r>
     </w:p>
     <w:p>
@@ -11913,7 +12172,7 @@
           <w:b/>
           <w:lang w:val="ru-RU"/>
         </w:rPr>
-        <w:t>Пример 1. Канцеляризм + избыточное «в настоящий момент времени» (источник: Мир новостей, №18, 29.04.2026).</w:t>
+        <w:t>Пример 1. Канцеляризм + избыточное «в настоящий момент времени» (типичный случай для «Мир новостей», см. § 2.2 и § 2.3, таблица 4).</w:t>
       </w:r>
     </w:p>
     <w:p>
@@ -11970,7 +12229,7 @@
           <w:lang w:val="ru-RU"/>
         </w:rPr>
         <w:lastRenderedPageBreak/>
-        <w:t>Пример 2. Канцеляризм-цепочка «осуществление мероприятий» (источник: Мир новостей (типичный для аналитических изданий)).</w:t>
+        <w:t>Пример 2. Канцеляризм-цепочка «осуществление мероприятий» (типичный случай для аналитических изданий, см. § 2.2 и таблица 3).</w:t>
       </w:r>
     </w:p>
     <w:p>
@@ -12026,7 +12285,7 @@
           <w:b/>
           <w:lang w:val="ru-RU"/>
         </w:rPr>
-        <w:t>Пример 3. Канцеляризм в репортаже («осуществляется проведение») (источник: Комсомольская правда (репортаж)).</w:t>
+        <w:t>Пример 3. Канцеляризм в репортаже («осуществляется проведение») (типичный случай для «Комсомольской правды», см. § 2.2 и таблица 3).</w:t>
       </w:r>
     </w:p>
     <w:p>
@@ -12097,7 +12356,7 @@
           <w:b/>
           <w:lang w:val="ru-RU"/>
         </w:rPr>
-        <w:t>Пример 4. Родительная цепочка из 4 элементов (источник: Мир новостей).</w:t>
+        <w:t>Пример 4. Родительная цепочка из 4 элементов (типичный случай для «Мир новостей», см. § 2.3 и таблица 4).</w:t>
       </w:r>
     </w:p>
     <w:p>
@@ -12154,7 +12413,7 @@
           <w:b/>
           <w:lang w:val="ru-RU"/>
         </w:rPr>
-        <w:t>Пример 5. Цепочка с техническим термином (источник: Аргументы и факты).</w:t>
+        <w:t>Пример 5. Цепочка с техническим термином (типичный случай для «Аргументов и фактов», см. § 2.3).</w:t>
       </w:r>
     </w:p>
     <w:p>
@@ -12225,7 +12484,7 @@
           <w:b/>
           <w:lang w:val="ru-RU"/>
         </w:rPr>
-        <w:t>Пример 6. Излишняя парцелляция перечисления (источник: Экспресс-газета (материал о С. Филиппове)).</w:t>
+        <w:t>Пример 6. Излишняя парцелляция перечисления (типичный случай для «Экспресс-газеты», см. § 2.3 и таблица 4 — парцелляция отмечена в 12 из 24 материалов).</w:t>
       </w:r>
     </w:p>
     <w:p>
@@ -12281,7 +12540,7 @@
           <w:b/>
           <w:lang w:val="ru-RU"/>
         </w:rPr>
-        <w:t>Пример 7. Парцелляция с повтором «И всё…» (источник: Экспресс-газета, №12С, апрель 2026).</w:t>
+        <w:t>Пример 7. Парцелляция с повтором «И всё…» (типичный случай для «Экспресс-газеты», см. § 2.3 — приём избыточен на фоне общей высокой частотности парцелляции в издании).</w:t>
       </w:r>
     </w:p>
     <w:p>
@@ -12360,7 +12619,7 @@
           <w:b/>
           <w:lang w:val="ru-RU"/>
         </w:rPr>
-        <w:t>Пример 8. Канцелярит соседствует с разговорной частицей (источник: Комсомольская правда (репортаж)).</w:t>
+        <w:t>Пример 8. Канцелярит соседствует с разговорной частицей (типичный случай для «Комсомольской правды», см. § 2.2 о смешении регистров).</w:t>
       </w:r>
     </w:p>
     <w:p>
@@ -12416,7 +12675,7 @@
           <w:b/>
           <w:lang w:val="ru-RU"/>
         </w:rPr>
-        <w:t>Пример 9. Просторечие в новостном жанре (источник: Комсомольская правда (материал о Курской области)).</w:t>
+        <w:t>Пример 9. Просторечие в новостном жанре (типичный случай для «Комсомольской правды», см. § 2.2 и таблица 3 — высокий показатель по просторечиям).</w:t>
       </w:r>
     </w:p>
     <w:p>
@@ -12488,7 +12747,7 @@
           <w:b/>
           <w:lang w:val="ru-RU"/>
         </w:rPr>
-        <w:t>Пример 10. Скопление заимствований в бытовой теме (источник: Экспресс-газета (типичный материал шоу-бизнеса)).</w:t>
+        <w:t>Пример 10. Скопление заимствований в бытовой теме (типичный случай для «Экспресс-газеты», см. § 2.2 и таблица 3 — 11 случаев неоправданных заимствований в выборке).</w:t>
       </w:r>
     </w:p>
     <w:p>
@@ -12559,7 +12818,7 @@
           <w:b/>
           <w:lang w:val="ru-RU"/>
         </w:rPr>
-        <w:t>Пример 11. Тавтологические сочетания (источник: Универсальный пример).</w:t>
+        <w:t>Пример 11. Тавтологические сочетания (универсальный случай — встречается во всех проанализированных изданиях, см. § 2.2).</w:t>
       </w:r>
     </w:p>
     <w:p>
@@ -12615,7 +12874,7 @@
           <w:b/>
           <w:lang w:val="ru-RU"/>
         </w:rPr>
-        <w:t>Пример 12. Перегруженное сложное предложение (источник: Мир новостей).</w:t>
+        <w:t>Пример 12. Перегруженное сложное предложение (типичный случай для «Мир новостей», см. § 2.3 и таблица 4 — высокая средняя сложность предложений).</w:t>
       </w:r>
     </w:p>
     <w:p>
@@ -13328,7 +13587,7 @@
         <w:rPr>
           <w:lang w:val="ru-RU"/>
         </w:rPr>
-        <w:t>Проведённый анализ выявил, что в газетных текстах часто встречаются конструкции из трёх и более существительных в родительном падеже, которые затрудняют понимание. Эта рекомендация особенно актуальна для аналитических изданий («Мир новостей», «Аргументы и факты»), где такие цепочки встречаются чаще всего.</w:t>
+        <w:t>Основание: § 2.3, таблица 4 (родительные цепочки длиной 4–5 слов в «Мире новостей»). Цепочки из трёх и более существительных в родительном падеже затрудняют понимание; редактору следует разрывать их в первую очередь в «Мире новостей» и «Аргументах и фактах».</w:t>
       </w:r>
     </w:p>
     <w:p>
@@ -13447,7 +13706,7 @@
         <w:rPr>
           <w:lang w:val="ru-RU"/>
         </w:rPr>
-        <w:t>Собранные данные свидетельствуют о том, что длинные предложения затрудняют чтение. Редактору рекомендуется разбивать их на 2-3 коротких; в первую очередь это касается новостных заметок массовых ежедневных газет («Комсомольская правда») и материалов для широкой аудитории.</w:t>
+        <w:t>Основание: § 2.3, таблица 4 (высокая средняя сложность предложений в «Мире новостей»). Длинные предложения затрудняют чтение; редактору рекомендуется разбивать их на 2–3 коротких, прежде всего в новостных заметках массовых ежедневных газет и в текстах для широкой аудитории.</w:t>
       </w:r>
     </w:p>
     <w:p>
@@ -13567,7 +13826,7 @@
           <w:lang w:val="ru-RU"/>
         </w:rPr>
         <w:lastRenderedPageBreak/>
-        <w:t>Как было установлено во второй главе, частая парцелляция создаёт «рваный» текст. Эта проблема наиболее характерна для бульварно-развлекательных изданий («Экспресс-газета»). Редактору рекомендуется объединять парцеллированные конструкции в одно предложение там, где это не разрушает стилистический замысел.</w:t>
+        <w:t>Основание: § 2.3, таблица 4 (парцелляция в 12 из 24 материалов «Экспресс-газеты»). Частая парцелляция создаёт «рваный» текст; редактору следует объединять парцеллированные фрагменты, не разрушая стилистический замысел.</w:t>
       </w:r>
     </w:p>
     <w:p>
@@ -13686,7 +13945,7 @@
         <w:rPr>
           <w:lang w:val="ru-RU"/>
         </w:rPr>
-        <w:t>В ходе исследования зафиксировано, что в газетных текстах встречаются просторечия и неоправданные заимствования, прежде всего в «Экспресс-газете» и «Комсомольской правде». Редактору рекомендуется заменять их нейтральными или литературными аналогами, особенно в информационных жанрах.</w:t>
+        <w:t>Основание: § 2.2, таблица 3 (просторечия — 3,3–4,1 случая на 10 материалов в «КП» и «ЭГ»; неоправданные заимствования — 4,6 случая на 10 материалов в «ЭГ»). Редактору следует заменять такие единицы нейтральными аналогами, особенно в информационных жанрах.</w:t>
       </w:r>
     </w:p>
     <w:p>
@@ -13720,7 +13979,7 @@
         <w:rPr>
           <w:lang w:val="ru-RU"/>
         </w:rPr>
-        <w:t>Материал второй главы подтвердил, что в газетных текстах нередко соседствуют разговорная и официально-деловая лексика; особенно остро эта проблема стоит в «Комсомольской правде» и «Экспресс-газете». Редактору рекомендуется унифицировать стиль в пределах каждого материала; для новостных заметок выбирать нейтральную манеру, а для репортажей — разговорную, но без канцеляризмов.</w:t>
+        <w:t>Основание: § 2.2 (смешение регистров в «КП» и «ЭГ»). Редактору следует унифицировать стиль в пределах каждого материала: для новостной заметки — нейтральная манера, для репортажа — разговорная, но без канцеляризмов.</w:t>
       </w:r>
     </w:p>
     <w:p>
@@ -13822,7 +14081,20 @@
         <w:rPr>
           <w:lang w:val="ru-RU"/>
         </w:rPr>
-        <w:t>Обнаружено, что в газетных текстах встречаются фактические ошибки. Редактор обязан проверять все имена, даты, цифры и цитаты по надёжным источникам, а для сложных тем использовать дополнительную сверку.</w:t>
+        <w:t>Основание: § 3.1, этап 4 (финальная вычитка). Редактор обязан сверять имена, даты, цифры и цитаты по надёжным источникам; для сложных тем — привлекать дополнительные источники.</w:t>
+      </w:r>
+    </w:p>
+    <w:p>
+      <w:pPr>
+        <w:rPr>
+          <w:lang w:val="ru-RU"/>
+        </w:rPr>
+      </w:pPr>
+      <w:r>
+        <w:rPr>
+          <w:lang w:val="ru-RU"/>
+        </w:rPr>
+        <w:t xml:space="preserve">Рекомендация 7. Устранять повторы и тавтологию. Основание: § 3.2, пример 11 (тавтологии «задать задачу», «рассказать рассказ», «выйти наружу»). Редактор заменяет повторы синонимами или перестраивает предложение; особое внимание — началам соседних предложений.</w:t>
       </w:r>
     </w:p>
     <w:p>
@@ -13837,49 +14109,28 @@
           <w:iCs/>
           <w:lang w:val="ru-RU"/>
         </w:rPr>
-        <w:t>Рекомендация 7.</w:t>
-      </w:r>
-      <w:r>
-        <w:rPr>
-          <w:lang w:val="ru-RU"/>
-        </w:rPr>
-        <w:t xml:space="preserve"> Устранять повторы и тавтологию. Тавтология встречается во всех изданиях, чаще всего в «Экспресс-газете». Редактор должен заменять повторяющиеся слова синонимами или перестраивать предложение. Например, вместо «задать задачу» — «поставить задачу», вместо «рассказать рассказ» — «поведать историю», вместо «выйти наружу» — просто «выйти». Особенно внимательно следует проверять начало соседних предложений — нельзя, чтобы два предложения подряд начинались с одного и того же слова («Он сказал… Он добавил…»).</w:t>
-      </w:r>
-    </w:p>
-    <w:p>
-      <w:pPr>
-        <w:rPr>
-          <w:lang w:val="ru-RU"/>
-        </w:rPr>
-      </w:pPr>
-      <w:r>
+        <w:t xml:space="preserve">Рекомендация 8. </w:t>
+      </w:r>
+      <w:r>
+        <w:rPr>
+          <w:lang w:val="ru-RU"/>
+        </w:rPr>
+        <w:t>Адаптировать язык под аудиторию издания.</w:t>
+      </w:r>
+    </w:p>
+    <w:p>
+      <w:pPr>
         <w:rPr>
           <w:i/>
           <w:iCs/>
           <w:lang w:val="ru-RU"/>
         </w:rPr>
-        <w:t xml:space="preserve">Рекомендация 8. </w:t>
-      </w:r>
-      <w:r>
-        <w:rPr>
-          <w:lang w:val="ru-RU"/>
-        </w:rPr>
-        <w:t>Адаптировать язык под аудиторию издания.</w:t>
-      </w:r>
-    </w:p>
-    <w:p>
-      <w:pPr>
-        <w:rPr>
-          <w:i/>
-          <w:iCs/>
-          <w:lang w:val="ru-RU"/>
-        </w:rPr>
-      </w:pPr>
-      <w:r>
-        <w:rPr>
-          <w:lang w:val="ru-RU"/>
-        </w:rPr>
-        <w:t>Результаты исследования убедительно демонстрируют, что разные издания ориентированы на разную аудиторию, и язык должен этому соответствовать. Для массовых ежедневных газет («Комсомольская правда») язык должен быть лёгким и динамичным; для аналитических еженедельников («Мир новостей», «Аргументы и факты») — точным, логичным и более сдержанным; для бульварно-развлекательной прессы («Экспресс-газета») допустима повышенная экспрессия, но в рамках литературной нормы.</w:t>
+      </w:pPr>
+      <w:r>
+        <w:rPr>
+          <w:lang w:val="ru-RU"/>
+        </w:rPr>
+        <w:t>Основание: § 2.5, таблица 7 и рисунок 2 (стилистические профили изданий). Язык должен соответствовать аудитории: для «КП» — лёгкий и динамичный; для «МН» и «АиФ» — точный, логичный, сдержанный; для «ЭГ» — экспрессивный, но в пределах литературной нормы.</w:t>
       </w:r>
     </w:p>
     <w:p>
@@ -13927,6 +14178,932 @@
           <w:lang w:val="ru-RU"/>
         </w:rPr>
         <w:br w:type="page"/>
+      </w:r>
+    </w:p>
+    <w:p>
+      <w:pPr>
+        <w:pStyle w:val="2"/>
+        <w:ind w:firstLineChars="0" w:firstLine="0"/>
+        <w:rPr>
+          <w:lang w:val="ru-RU"/>
+        </w:rPr>
+      </w:pPr>
+      <w:r>
+        <w:rPr>
+          <w:lang w:val="ru-RU"/>
+        </w:rPr>
+        <w:t xml:space="preserve">3.4. Чек-лист редактора газетного материала</w:t>
+      </w:r>
+    </w:p>
+    <w:p>
+      <w:pPr>
+        <w:rPr>
+          <w:lang w:val="ru-RU"/>
+        </w:rPr>
+      </w:pPr>
+      <w:r>
+        <w:rPr>
+          <w:lang w:val="ru-RU"/>
+        </w:rPr>
+        <w:t xml:space="preserve">Для практической работы редактора результаты второй и третьей глав сведены в краткий чек-лист (таблица 9). Чек-лист охватывает основные группы проблем, выявленные при анализе четырёх изданий, и связывает каждую проблему с конкретным действием по её устранению. Каждая строка таблицы соотнесена с параграфом или таблицей второй главы, где описана соответствующая проблема, что позволяет редактору при необходимости вернуться к исходному анализу.</w:t>
+      </w:r>
+    </w:p>
+    <w:p>
+      <w:pPr>
+        <w:rPr>
+          <w:lang w:val="ru-RU"/>
+        </w:rPr>
+      </w:pPr>
+      <w:r>
+        <w:rPr>
+          <w:lang w:val="ru-RU"/>
+        </w:rPr>
+        <w:t xml:space="preserve">Таблица 9 — Чек-лист редактора: что проверять, как проверить, что делать</w:t>
+      </w:r>
+    </w:p>
+    <w:tbl>
+      <w:tblPr>
+        <w:tblW w:w="9000" w:type="dxa"/>
+        <w:jc w:val="center"/>
+        <w:tblBorders>
+          <w:top w:val="single" w:sz="4" w:space="0" w:color="auto"/>
+          <w:left w:val="single" w:sz="4" w:space="0" w:color="auto"/>
+          <w:bottom w:val="single" w:sz="4" w:space="0" w:color="auto"/>
+          <w:right w:val="single" w:sz="4" w:space="0" w:color="auto"/>
+          <w:insideH w:val="single" w:sz="4" w:space="0" w:color="auto"/>
+          <w:insideV w:val="single" w:sz="4" w:space="0" w:color="auto"/>
+        </w:tblBorders>
+        <w:tblLook w:val="04A0" w:firstRow="1" w:lastRow="0" w:firstColumn="1" w:lastColumn="0" w:noHBand="0" w:noVBand="1"/>
+      </w:tblPr>
+      <w:tblGrid>
+        <w:gridCol w:w="2500"/>
+        <w:gridCol w:w="3300"/>
+        <w:gridCol w:w="3200"/>
+      </w:tblGrid>
+      <w:tr>
+        <w:trPr>
+          <w:tblHeader/>
+          <w:jc w:val="center"/>
+        </w:trPr>
+        <w:tc>
+          <w:tcPr>
+            <w:tcW w:w="2500" w:type="dxa"/>
+            <w:shd w:val="clear" w:color="auto" w:fill="EEEEEE"/>
+            <w:vAlign w:val="center"/>
+          </w:tcPr>
+          <w:p>
+            <w:pPr>
+              <w:spacing w:line="240" w:lineRule="auto"/>
+              <w:ind w:firstLine="0"/>
+              <w:jc w:val="center"/>
+            </w:pPr>
+            <w:r>
+              <w:rPr>
+                <w:b/>
+                <w:sz w:val="22"/>
+                <w:szCs w:val="22"/>
+              </w:rPr>
+              <w:t xml:space="preserve">Что проверять (проблема)</w:t>
+            </w:r>
+          </w:p>
+        </w:tc>
+        <w:tc>
+          <w:tcPr>
+            <w:tcW w:w="3300" w:type="dxa"/>
+            <w:shd w:val="clear" w:color="auto" w:fill="EEEEEE"/>
+            <w:vAlign w:val="center"/>
+          </w:tcPr>
+          <w:p>
+            <w:pPr>
+              <w:spacing w:line="240" w:lineRule="auto"/>
+              <w:ind w:firstLine="0"/>
+              <w:jc w:val="center"/>
+            </w:pPr>
+            <w:r>
+              <w:rPr>
+                <w:b/>
+                <w:sz w:val="22"/>
+                <w:szCs w:val="22"/>
+              </w:rPr>
+              <w:t xml:space="preserve">Как проверить (маркер)</w:t>
+            </w:r>
+          </w:p>
+        </w:tc>
+        <w:tc>
+          <w:tcPr>
+            <w:tcW w:w="3200" w:type="dxa"/>
+            <w:shd w:val="clear" w:color="auto" w:fill="EEEEEE"/>
+            <w:vAlign w:val="center"/>
+          </w:tcPr>
+          <w:p>
+            <w:pPr>
+              <w:spacing w:line="240" w:lineRule="auto"/>
+              <w:ind w:firstLine="0"/>
+              <w:jc w:val="center"/>
+            </w:pPr>
+            <w:r>
+              <w:rPr>
+                <w:b/>
+                <w:sz w:val="22"/>
+                <w:szCs w:val="22"/>
+              </w:rPr>
+              <w:t xml:space="preserve">Что делать (действие)</w:t>
+            </w:r>
+          </w:p>
+        </w:tc>
+      </w:tr>
+      <w:tr>
+        <w:trPr>
+          <w:jc w:val="center"/>
+        </w:trPr>
+        <w:tc>
+          <w:tcPr>
+            <w:tcW w:w="2500" w:type="dxa"/>
+            <w:vAlign w:val="center"/>
+          </w:tcPr>
+          <w:p>
+            <w:pPr>
+              <w:spacing w:line="240" w:lineRule="auto"/>
+              <w:ind w:firstLine="0"/>
+              <w:jc w:val="center"/>
+            </w:pPr>
+            <w:r>
+              <w:rPr>
+                <w:sz w:val="22"/>
+                <w:szCs w:val="22"/>
+              </w:rPr>
+              <w:t xml:space="preserve">Родительные цепочки</w:t>
+            </w:r>
+          </w:p>
+        </w:tc>
+        <w:tc>
+          <w:tcPr>
+            <w:tcW w:w="3300" w:type="dxa"/>
+            <w:vAlign w:val="center"/>
+          </w:tcPr>
+          <w:p>
+            <w:pPr>
+              <w:spacing w:line="240" w:lineRule="auto"/>
+              <w:ind w:firstLine="0"/>
+              <w:jc w:val="center"/>
+            </w:pPr>
+            <w:r>
+              <w:rPr>
+                <w:sz w:val="22"/>
+                <w:szCs w:val="22"/>
+              </w:rPr>
+              <w:t xml:space="preserve">В предложении подряд 3+ существительных в родительном падеже</w:t>
+            </w:r>
+          </w:p>
+        </w:tc>
+        <w:tc>
+          <w:tcPr>
+            <w:tcW w:w="3200" w:type="dxa"/>
+            <w:vAlign w:val="center"/>
+          </w:tcPr>
+          <w:p>
+            <w:pPr>
+              <w:spacing w:line="240" w:lineRule="auto"/>
+              <w:ind w:firstLine="0"/>
+              <w:jc w:val="center"/>
+            </w:pPr>
+            <w:r>
+              <w:rPr>
+                <w:sz w:val="22"/>
+                <w:szCs w:val="22"/>
+              </w:rPr>
+              <w:t xml:space="preserve">Разорвать цепочку: ввести глагол, придаточное или предлог (см. § 2.3, рек. 1)</w:t>
+            </w:r>
+          </w:p>
+        </w:tc>
+      </w:tr>
+      <w:tr>
+        <w:trPr>
+          <w:jc w:val="center"/>
+        </w:trPr>
+        <w:tc>
+          <w:tcPr>
+            <w:tcW w:w="2500" w:type="dxa"/>
+            <w:vAlign w:val="center"/>
+          </w:tcPr>
+          <w:p>
+            <w:pPr>
+              <w:spacing w:line="240" w:lineRule="auto"/>
+              <w:ind w:firstLine="0"/>
+              <w:jc w:val="center"/>
+            </w:pPr>
+            <w:r>
+              <w:rPr>
+                <w:sz w:val="22"/>
+                <w:szCs w:val="22"/>
+              </w:rPr>
+              <w:t xml:space="preserve">Длинные предложения</w:t>
+            </w:r>
+          </w:p>
+        </w:tc>
+        <w:tc>
+          <w:tcPr>
+            <w:tcW w:w="3300" w:type="dxa"/>
+            <w:vAlign w:val="center"/>
+          </w:tcPr>
+          <w:p>
+            <w:pPr>
+              <w:spacing w:line="240" w:lineRule="auto"/>
+              <w:ind w:firstLine="0"/>
+              <w:jc w:val="center"/>
+            </w:pPr>
+            <w:r>
+              <w:rPr>
+                <w:sz w:val="22"/>
+                <w:szCs w:val="22"/>
+              </w:rPr>
+              <w:t xml:space="preserve">Предложение длиннее 20 слов; 2+ придаточных</w:t>
+            </w:r>
+          </w:p>
+        </w:tc>
+        <w:tc>
+          <w:tcPr>
+            <w:tcW w:w="3200" w:type="dxa"/>
+            <w:vAlign w:val="center"/>
+          </w:tcPr>
+          <w:p>
+            <w:pPr>
+              <w:spacing w:line="240" w:lineRule="auto"/>
+              <w:ind w:firstLine="0"/>
+              <w:jc w:val="center"/>
+            </w:pPr>
+            <w:r>
+              <w:rPr>
+                <w:sz w:val="22"/>
+                <w:szCs w:val="22"/>
+              </w:rPr>
+              <w:t xml:space="preserve">Разбить на 2–3 коротких по границам союзов «который», «что», «когда» (см. рек. 2)</w:t>
+            </w:r>
+          </w:p>
+        </w:tc>
+      </w:tr>
+      <w:tr>
+        <w:trPr>
+          <w:jc w:val="center"/>
+        </w:trPr>
+        <w:tc>
+          <w:tcPr>
+            <w:tcW w:w="2500" w:type="dxa"/>
+            <w:vAlign w:val="center"/>
+          </w:tcPr>
+          <w:p>
+            <w:pPr>
+              <w:spacing w:line="240" w:lineRule="auto"/>
+              <w:ind w:firstLine="0"/>
+              <w:jc w:val="center"/>
+            </w:pPr>
+            <w:r>
+              <w:rPr>
+                <w:sz w:val="22"/>
+                <w:szCs w:val="22"/>
+              </w:rPr>
+              <w:t xml:space="preserve">Избыточная парцелляция</w:t>
+            </w:r>
+          </w:p>
+        </w:tc>
+        <w:tc>
+          <w:tcPr>
+            <w:tcW w:w="3300" w:type="dxa"/>
+            <w:vAlign w:val="center"/>
+          </w:tcPr>
+          <w:p>
+            <w:pPr>
+              <w:spacing w:line="240" w:lineRule="auto"/>
+              <w:ind w:firstLine="0"/>
+              <w:jc w:val="center"/>
+            </w:pPr>
+            <w:r>
+              <w:rPr>
+                <w:sz w:val="22"/>
+                <w:szCs w:val="22"/>
+              </w:rPr>
+              <w:t xml:space="preserve">Подряд 2+ коротких парцеллированных предложения, повторы «И всё... И всё...»</w:t>
+            </w:r>
+          </w:p>
+        </w:tc>
+        <w:tc>
+          <w:tcPr>
+            <w:tcW w:w="3200" w:type="dxa"/>
+            <w:vAlign w:val="center"/>
+          </w:tcPr>
+          <w:p>
+            <w:pPr>
+              <w:spacing w:line="240" w:lineRule="auto"/>
+              <w:ind w:firstLine="0"/>
+              <w:jc w:val="center"/>
+            </w:pPr>
+            <w:r>
+              <w:rPr>
+                <w:sz w:val="22"/>
+                <w:szCs w:val="22"/>
+              </w:rPr>
+              <w:t xml:space="preserve">Объединить в одно предложение, если не теряется стилистический акцент (см. рек. 3)</w:t>
+            </w:r>
+          </w:p>
+        </w:tc>
+      </w:tr>
+      <w:tr>
+        <w:trPr>
+          <w:jc w:val="center"/>
+        </w:trPr>
+        <w:tc>
+          <w:tcPr>
+            <w:tcW w:w="2500" w:type="dxa"/>
+            <w:vAlign w:val="center"/>
+          </w:tcPr>
+          <w:p>
+            <w:pPr>
+              <w:spacing w:line="240" w:lineRule="auto"/>
+              <w:ind w:firstLine="0"/>
+              <w:jc w:val="center"/>
+            </w:pPr>
+            <w:r>
+              <w:rPr>
+                <w:sz w:val="22"/>
+                <w:szCs w:val="22"/>
+              </w:rPr>
+              <w:t xml:space="preserve">Канцеляризмы</w:t>
+            </w:r>
+          </w:p>
+        </w:tc>
+        <w:tc>
+          <w:tcPr>
+            <w:tcW w:w="3300" w:type="dxa"/>
+            <w:vAlign w:val="center"/>
+          </w:tcPr>
+          <w:p>
+            <w:pPr>
+              <w:spacing w:line="240" w:lineRule="auto"/>
+              <w:ind w:firstLine="0"/>
+              <w:jc w:val="center"/>
+            </w:pPr>
+            <w:r>
+              <w:rPr>
+                <w:sz w:val="22"/>
+                <w:szCs w:val="22"/>
+              </w:rPr>
+              <w:t xml:space="preserve">Обороты «в рамках», «осуществляется», «было принято решение», «находится в стадии»</w:t>
+            </w:r>
+          </w:p>
+        </w:tc>
+        <w:tc>
+          <w:tcPr>
+            <w:tcW w:w="3200" w:type="dxa"/>
+            <w:vAlign w:val="center"/>
+          </w:tcPr>
+          <w:p>
+            <w:pPr>
+              <w:spacing w:line="240" w:lineRule="auto"/>
+              <w:ind w:firstLine="0"/>
+              <w:jc w:val="center"/>
+            </w:pPr>
+            <w:r>
+              <w:rPr>
+                <w:sz w:val="22"/>
+                <w:szCs w:val="22"/>
+              </w:rPr>
+              <w:t xml:space="preserve">Заменить активным глаголом действия; убрать «осуществление», «реализация» (см. § 2.2, пример 1)</w:t>
+            </w:r>
+          </w:p>
+        </w:tc>
+      </w:tr>
+      <w:tr>
+        <w:trPr>
+          <w:jc w:val="center"/>
+        </w:trPr>
+        <w:tc>
+          <w:tcPr>
+            <w:tcW w:w="2500" w:type="dxa"/>
+            <w:vAlign w:val="center"/>
+          </w:tcPr>
+          <w:p>
+            <w:pPr>
+              <w:spacing w:line="240" w:lineRule="auto"/>
+              <w:ind w:firstLine="0"/>
+              <w:jc w:val="center"/>
+            </w:pPr>
+            <w:r>
+              <w:rPr>
+                <w:sz w:val="22"/>
+                <w:szCs w:val="22"/>
+              </w:rPr>
+              <w:t xml:space="preserve">Просторечия в новости</w:t>
+            </w:r>
+          </w:p>
+        </w:tc>
+        <w:tc>
+          <w:tcPr>
+            <w:tcW w:w="3300" w:type="dxa"/>
+            <w:vAlign w:val="center"/>
+          </w:tcPr>
+          <w:p>
+            <w:pPr>
+              <w:spacing w:line="240" w:lineRule="auto"/>
+              <w:ind w:firstLine="0"/>
+              <w:jc w:val="center"/>
+            </w:pPr>
+            <w:r>
+              <w:rPr>
+                <w:sz w:val="22"/>
+                <w:szCs w:val="22"/>
+              </w:rPr>
+              <w:t xml:space="preserve">Слова с пометами «разг.», «прост.», «груб.» в новостной заметке</w:t>
+            </w:r>
+          </w:p>
+        </w:tc>
+        <w:tc>
+          <w:tcPr>
+            <w:tcW w:w="3200" w:type="dxa"/>
+            <w:vAlign w:val="center"/>
+          </w:tcPr>
+          <w:p>
+            <w:pPr>
+              <w:spacing w:line="240" w:lineRule="auto"/>
+              <w:ind w:firstLine="0"/>
+              <w:jc w:val="center"/>
+            </w:pPr>
+            <w:r>
+              <w:rPr>
+                <w:sz w:val="22"/>
+                <w:szCs w:val="22"/>
+              </w:rPr>
+              <w:t xml:space="preserve">Заменить нейтральным синонимом; разговорность оставить только в репортаже (см. рек. 4)</w:t>
+            </w:r>
+          </w:p>
+        </w:tc>
+      </w:tr>
+      <w:tr>
+        <w:trPr>
+          <w:jc w:val="center"/>
+        </w:trPr>
+        <w:tc>
+          <w:tcPr>
+            <w:tcW w:w="2500" w:type="dxa"/>
+            <w:vAlign w:val="center"/>
+          </w:tcPr>
+          <w:p>
+            <w:pPr>
+              <w:spacing w:line="240" w:lineRule="auto"/>
+              <w:ind w:firstLine="0"/>
+              <w:jc w:val="center"/>
+            </w:pPr>
+            <w:r>
+              <w:rPr>
+                <w:sz w:val="22"/>
+                <w:szCs w:val="22"/>
+              </w:rPr>
+              <w:t xml:space="preserve">Неоправданные заимствования</w:t>
+            </w:r>
+          </w:p>
+        </w:tc>
+        <w:tc>
+          <w:tcPr>
+            <w:tcW w:w="3300" w:type="dxa"/>
+            <w:vAlign w:val="center"/>
+          </w:tcPr>
+          <w:p>
+            <w:pPr>
+              <w:spacing w:line="240" w:lineRule="auto"/>
+              <w:ind w:firstLine="0"/>
+              <w:jc w:val="center"/>
+            </w:pPr>
+            <w:r>
+              <w:rPr>
+                <w:sz w:val="22"/>
+                <w:szCs w:val="22"/>
+              </w:rPr>
+              <w:t xml:space="preserve">Иностранное слово при наличии русского эквивалента в бытовом контексте</w:t>
+            </w:r>
+          </w:p>
+        </w:tc>
+        <w:tc>
+          <w:tcPr>
+            <w:tcW w:w="3200" w:type="dxa"/>
+            <w:vAlign w:val="center"/>
+          </w:tcPr>
+          <w:p>
+            <w:pPr>
+              <w:spacing w:line="240" w:lineRule="auto"/>
+              <w:ind w:firstLine="0"/>
+              <w:jc w:val="center"/>
+            </w:pPr>
+            <w:r>
+              <w:rPr>
+                <w:sz w:val="22"/>
+                <w:szCs w:val="22"/>
+              </w:rPr>
+              <w:t xml:space="preserve">Заменить устоявшимся русским эквивалентом (абьюзер → обидчик, кастинг → прослушивание) (см. § 2.2, пример 10)</w:t>
+            </w:r>
+          </w:p>
+        </w:tc>
+      </w:tr>
+      <w:tr>
+        <w:trPr>
+          <w:jc w:val="center"/>
+        </w:trPr>
+        <w:tc>
+          <w:tcPr>
+            <w:tcW w:w="2500" w:type="dxa"/>
+            <w:vAlign w:val="center"/>
+          </w:tcPr>
+          <w:p>
+            <w:pPr>
+              <w:spacing w:line="240" w:lineRule="auto"/>
+              <w:ind w:firstLine="0"/>
+              <w:jc w:val="center"/>
+            </w:pPr>
+            <w:r>
+              <w:rPr>
+                <w:sz w:val="22"/>
+                <w:szCs w:val="22"/>
+              </w:rPr>
+              <w:t xml:space="preserve">Смешение регистров</w:t>
+            </w:r>
+          </w:p>
+        </w:tc>
+        <w:tc>
+          <w:tcPr>
+            <w:tcW w:w="3300" w:type="dxa"/>
+            <w:vAlign w:val="center"/>
+          </w:tcPr>
+          <w:p>
+            <w:pPr>
+              <w:spacing w:line="240" w:lineRule="auto"/>
+              <w:ind w:firstLine="0"/>
+              <w:jc w:val="center"/>
+            </w:pPr>
+            <w:r>
+              <w:rPr>
+                <w:sz w:val="22"/>
+                <w:szCs w:val="22"/>
+              </w:rPr>
+              <w:t xml:space="preserve">В одном абзаце книжный и разговорный регистры</w:t>
+            </w:r>
+          </w:p>
+        </w:tc>
+        <w:tc>
+          <w:tcPr>
+            <w:tcW w:w="3200" w:type="dxa"/>
+            <w:vAlign w:val="center"/>
+          </w:tcPr>
+          <w:p>
+            <w:pPr>
+              <w:spacing w:line="240" w:lineRule="auto"/>
+              <w:ind w:firstLine="0"/>
+              <w:jc w:val="center"/>
+            </w:pPr>
+            <w:r>
+              <w:rPr>
+                <w:sz w:val="22"/>
+                <w:szCs w:val="22"/>
+              </w:rPr>
+              <w:t xml:space="preserve">Унифицировать стиль: выбрать регистр под жанр (новость — нейтральный, репортаж — разговорный) (см. рек. 5)</w:t>
+            </w:r>
+          </w:p>
+        </w:tc>
+      </w:tr>
+      <w:tr>
+        <w:trPr>
+          <w:jc w:val="center"/>
+        </w:trPr>
+        <w:tc>
+          <w:tcPr>
+            <w:tcW w:w="2500" w:type="dxa"/>
+            <w:vAlign w:val="center"/>
+          </w:tcPr>
+          <w:p>
+            <w:pPr>
+              <w:spacing w:line="240" w:lineRule="auto"/>
+              <w:ind w:firstLine="0"/>
+              <w:jc w:val="center"/>
+            </w:pPr>
+            <w:r>
+              <w:rPr>
+                <w:sz w:val="22"/>
+                <w:szCs w:val="22"/>
+              </w:rPr>
+              <w:t xml:space="preserve">Тавтология и плеоназм</w:t>
+            </w:r>
+          </w:p>
+        </w:tc>
+        <w:tc>
+          <w:tcPr>
+            <w:tcW w:w="3300" w:type="dxa"/>
+            <w:vAlign w:val="center"/>
+          </w:tcPr>
+          <w:p>
+            <w:pPr>
+              <w:spacing w:line="240" w:lineRule="auto"/>
+              <w:ind w:firstLine="0"/>
+              <w:jc w:val="center"/>
+            </w:pPr>
+            <w:r>
+              <w:rPr>
+                <w:sz w:val="22"/>
+                <w:szCs w:val="22"/>
+              </w:rPr>
+              <w:t xml:space="preserve">Однокоренные слова рядом; «выйти наружу», «рассказать рассказ»</w:t>
+            </w:r>
+          </w:p>
+        </w:tc>
+        <w:tc>
+          <w:tcPr>
+            <w:tcW w:w="3200" w:type="dxa"/>
+            <w:vAlign w:val="center"/>
+          </w:tcPr>
+          <w:p>
+            <w:pPr>
+              <w:spacing w:line="240" w:lineRule="auto"/>
+              <w:ind w:firstLine="0"/>
+              <w:jc w:val="center"/>
+            </w:pPr>
+            <w:r>
+              <w:rPr>
+                <w:sz w:val="22"/>
+                <w:szCs w:val="22"/>
+              </w:rPr>
+              <w:t xml:space="preserve">Заменить синонимом или удалить избыточный элемент (см. § 3.2, пример 11)</w:t>
+            </w:r>
+          </w:p>
+        </w:tc>
+      </w:tr>
+      <w:tr>
+        <w:trPr>
+          <w:jc w:val="center"/>
+        </w:trPr>
+        <w:tc>
+          <w:tcPr>
+            <w:tcW w:w="2500" w:type="dxa"/>
+            <w:vAlign w:val="center"/>
+          </w:tcPr>
+          <w:p>
+            <w:pPr>
+              <w:spacing w:line="240" w:lineRule="auto"/>
+              <w:ind w:firstLine="0"/>
+              <w:jc w:val="center"/>
+            </w:pPr>
+            <w:r>
+              <w:rPr>
+                <w:sz w:val="22"/>
+                <w:szCs w:val="22"/>
+              </w:rPr>
+              <w:t xml:space="preserve">Заголовок не работает</w:t>
+            </w:r>
+          </w:p>
+        </w:tc>
+        <w:tc>
+          <w:tcPr>
+            <w:tcW w:w="3300" w:type="dxa"/>
+            <w:vAlign w:val="center"/>
+          </w:tcPr>
+          <w:p>
+            <w:pPr>
+              <w:spacing w:line="240" w:lineRule="auto"/>
+              <w:ind w:firstLine="0"/>
+              <w:jc w:val="center"/>
+            </w:pPr>
+            <w:r>
+              <w:rPr>
+                <w:sz w:val="22"/>
+                <w:szCs w:val="22"/>
+              </w:rPr>
+              <w:t xml:space="preserve">Длинный заголовок (&gt;10 слов) или непонятен без подзаголовка</w:t>
+            </w:r>
+          </w:p>
+        </w:tc>
+        <w:tc>
+          <w:tcPr>
+            <w:tcW w:w="3200" w:type="dxa"/>
+            <w:vAlign w:val="center"/>
+          </w:tcPr>
+          <w:p>
+            <w:pPr>
+              <w:spacing w:line="240" w:lineRule="auto"/>
+              <w:ind w:firstLine="0"/>
+              <w:jc w:val="center"/>
+            </w:pPr>
+            <w:r>
+              <w:rPr>
+                <w:sz w:val="22"/>
+                <w:szCs w:val="22"/>
+              </w:rPr>
+              <w:t xml:space="preserve">Сократить; усилить предикативность или экспрессивность по типу издания (см. § 2.4)</w:t>
+            </w:r>
+          </w:p>
+        </w:tc>
+      </w:tr>
+      <w:tr>
+        <w:trPr>
+          <w:jc w:val="center"/>
+        </w:trPr>
+        <w:tc>
+          <w:tcPr>
+            <w:tcW w:w="2500" w:type="dxa"/>
+            <w:vAlign w:val="center"/>
+          </w:tcPr>
+          <w:p>
+            <w:pPr>
+              <w:spacing w:line="240" w:lineRule="auto"/>
+              <w:ind w:firstLine="0"/>
+              <w:jc w:val="center"/>
+            </w:pPr>
+            <w:r>
+              <w:rPr>
+                <w:sz w:val="22"/>
+                <w:szCs w:val="22"/>
+              </w:rPr>
+              <w:t xml:space="preserve">Визуальный шум</w:t>
+            </w:r>
+          </w:p>
+        </w:tc>
+        <w:tc>
+          <w:tcPr>
+            <w:tcW w:w="3300" w:type="dxa"/>
+            <w:vAlign w:val="center"/>
+          </w:tcPr>
+          <w:p>
+            <w:pPr>
+              <w:spacing w:line="240" w:lineRule="auto"/>
+              <w:ind w:firstLine="0"/>
+              <w:jc w:val="center"/>
+            </w:pPr>
+            <w:r>
+              <w:rPr>
+                <w:sz w:val="22"/>
+                <w:szCs w:val="22"/>
+              </w:rPr>
+              <w:t xml:space="preserve">На полосе 4+ конкурирующих акцентов (заголовок + фото + врезка + цитата + плашка)</w:t>
+            </w:r>
+          </w:p>
+        </w:tc>
+        <w:tc>
+          <w:tcPr>
+            <w:tcW w:w="3200" w:type="dxa"/>
+            <w:vAlign w:val="center"/>
+          </w:tcPr>
+          <w:p>
+            <w:pPr>
+              <w:spacing w:line="240" w:lineRule="auto"/>
+              <w:ind w:firstLine="0"/>
+              <w:jc w:val="center"/>
+            </w:pPr>
+            <w:r>
+              <w:rPr>
+                <w:sz w:val="22"/>
+                <w:szCs w:val="22"/>
+              </w:rPr>
+              <w:t xml:space="preserve">Оставить 1–2 главных акцента; остальное перенести в подверстку (см. § 2.4, пример 2)</w:t>
+            </w:r>
+          </w:p>
+        </w:tc>
+      </w:tr>
+      <w:tr>
+        <w:trPr>
+          <w:jc w:val="center"/>
+        </w:trPr>
+        <w:tc>
+          <w:tcPr>
+            <w:tcW w:w="2500" w:type="dxa"/>
+            <w:vAlign w:val="center"/>
+          </w:tcPr>
+          <w:p>
+            <w:pPr>
+              <w:spacing w:line="240" w:lineRule="auto"/>
+              <w:ind w:firstLine="0"/>
+              <w:jc w:val="center"/>
+            </w:pPr>
+            <w:r>
+              <w:rPr>
+                <w:sz w:val="22"/>
+                <w:szCs w:val="22"/>
+              </w:rPr>
+              <w:t xml:space="preserve">Несогласованный цвет</w:t>
+            </w:r>
+          </w:p>
+        </w:tc>
+        <w:tc>
+          <w:tcPr>
+            <w:tcW w:w="3300" w:type="dxa"/>
+            <w:vAlign w:val="center"/>
+          </w:tcPr>
+          <w:p>
+            <w:pPr>
+              <w:spacing w:line="240" w:lineRule="auto"/>
+              <w:ind w:firstLine="0"/>
+              <w:jc w:val="center"/>
+            </w:pPr>
+            <w:r>
+              <w:rPr>
+                <w:sz w:val="22"/>
+                <w:szCs w:val="22"/>
+              </w:rPr>
+              <w:t xml:space="preserve">Плашка/врезка набрана в цвете, не входящем в фирменную палитру полосы</w:t>
+            </w:r>
+          </w:p>
+        </w:tc>
+        <w:tc>
+          <w:tcPr>
+            <w:tcW w:w="3200" w:type="dxa"/>
+            <w:vAlign w:val="center"/>
+          </w:tcPr>
+          <w:p>
+            <w:pPr>
+              <w:spacing w:line="240" w:lineRule="auto"/>
+              <w:ind w:firstLine="0"/>
+              <w:jc w:val="center"/>
+            </w:pPr>
+            <w:r>
+              <w:rPr>
+                <w:sz w:val="22"/>
+                <w:szCs w:val="22"/>
+              </w:rPr>
+              <w:t xml:space="preserve">Перекрасить в фирменный цвет или сделать нейтральной (см. § 2.4, пример 1)</w:t>
+            </w:r>
+          </w:p>
+        </w:tc>
+      </w:tr>
+      <w:tr>
+        <w:trPr>
+          <w:jc w:val="center"/>
+        </w:trPr>
+        <w:tc>
+          <w:tcPr>
+            <w:tcW w:w="2500" w:type="dxa"/>
+            <w:vAlign w:val="center"/>
+          </w:tcPr>
+          <w:p>
+            <w:pPr>
+              <w:spacing w:line="240" w:lineRule="auto"/>
+              <w:ind w:firstLine="0"/>
+              <w:jc w:val="center"/>
+            </w:pPr>
+            <w:r>
+              <w:rPr>
+                <w:sz w:val="22"/>
+                <w:szCs w:val="22"/>
+              </w:rPr>
+              <w:t xml:space="preserve">Фактическая неточность</w:t>
+            </w:r>
+          </w:p>
+        </w:tc>
+        <w:tc>
+          <w:tcPr>
+            <w:tcW w:w="3300" w:type="dxa"/>
+            <w:vAlign w:val="center"/>
+          </w:tcPr>
+          <w:p>
+            <w:pPr>
+              <w:spacing w:line="240" w:lineRule="auto"/>
+              <w:ind w:firstLine="0"/>
+              <w:jc w:val="center"/>
+            </w:pPr>
+            <w:r>
+              <w:rPr>
+                <w:sz w:val="22"/>
+                <w:szCs w:val="22"/>
+              </w:rPr>
+              <w:t xml:space="preserve">Имя, дата, цифра, цитата не сверены с источником</w:t>
+            </w:r>
+          </w:p>
+        </w:tc>
+        <w:tc>
+          <w:tcPr>
+            <w:tcW w:w="3200" w:type="dxa"/>
+            <w:vAlign w:val="center"/>
+          </w:tcPr>
+          <w:p>
+            <w:pPr>
+              <w:spacing w:line="240" w:lineRule="auto"/>
+              <w:ind w:firstLine="0"/>
+              <w:jc w:val="center"/>
+            </w:pPr>
+            <w:r>
+              <w:rPr>
+                <w:sz w:val="22"/>
+                <w:szCs w:val="22"/>
+              </w:rPr>
+              <w:t xml:space="preserve">Сверить по двум независимым источникам; в спорных случаях — снять (см. рек. 6)</w:t>
+            </w:r>
+          </w:p>
+        </w:tc>
+      </w:tr>
+    </w:tbl>
+    <w:p>
+      <w:pPr>
+        <w:rPr>
+          <w:lang w:val="ru-RU"/>
+        </w:rPr>
+      </w:pPr>
+      <w:r>
+        <w:rPr>
+          <w:lang w:val="ru-RU"/>
+        </w:rPr>
+        <w:t xml:space="preserve">Примечание: чек-лист построен по принципу «один экран — двенадцать пунктов» и предназначен для использования на этапе редакторского анализа (этап 3 в § 3.1). Полный набор приёмов правки и развёрнутые примеры приведены в § 3.2; рекомендации по системе редакторской работы — в § 3.3.</w:t>
       </w:r>
     </w:p>
     <w:p>
@@ -15871,6 +17048,73 @@
           <w:lang w:val="ru-RU"/>
         </w:rPr>
         <w:t>Экспресс-газета : Периодическое издание / апрель 2026 г. / №12С (187)</w:t>
+      </w:r>
+    </w:p>
+    <w:p>
+      <w:pPr>
+        <w:pStyle w:val="2"/>
+        <w:ind w:firstLineChars="0" w:firstLine="0"/>
+        <w:rPr>
+          <w:lang w:val="ru-RU"/>
+        </w:rPr>
+      </w:pPr>
+      <w:r>
+        <w:rPr>
+          <w:lang w:val="ru-RU"/>
+        </w:rPr>
+        <w:t xml:space="preserve">Приложение 1. Сканы полос с разбором визуальных элементов</w:t>
+      </w:r>
+    </w:p>
+    <w:p>
+      <w:pPr>
+        <w:rPr>
+          <w:lang w:val="ru-RU"/>
+        </w:rPr>
+      </w:pPr>
+      <w:r>
+        <w:rPr>
+          <w:lang w:val="ru-RU"/>
+        </w:rPr>
+        <w:t xml:space="preserve">Приложение содержит схематические описания трёх полос проанализированных изданий с разбором визуальных элементов. В печатном экземпляре работы на этих местах размещены сканы соответствующих полос с разметкой стрелками и подписями элементов («врезка», «выносная цитата», «фирменный цвет», «плашка»). Электронная версия работы сопровождает каждую полосу подробным описанием в § 2.4, примеры 1–3.</w:t>
+      </w:r>
+    </w:p>
+    <w:p>
+      <w:pPr>
+        <w:rPr>
+          <w:lang w:val="ru-RU"/>
+        </w:rPr>
+      </w:pPr>
+      <w:r>
+        <w:rPr>
+          <w:lang w:val="ru-RU"/>
+        </w:rPr>
+        <w:t xml:space="preserve">Рисунок П1 — «Комсомольская правда», 27.04.2026, № 31-n (27777), с. 5. Разбор: ключевой акцент — красная плашка-врезка с цифрой бюджета (несогласован с сине-серой палитрой полосы); см. § 2.4, пример 1.</w:t>
+      </w:r>
+    </w:p>
+    <w:p>
+      <w:pPr>
+        <w:rPr>
+          <w:lang w:val="ru-RU"/>
+        </w:rPr>
+      </w:pPr>
+      <w:r>
+        <w:rPr>
+          <w:lang w:val="ru-RU"/>
+        </w:rPr>
+        <w:t xml:space="preserve">Рисунок П2 — «Экспресс-газета», апрель 2026, № 12С (187). Разбор: четыре конкурирующих визуальных акцента (заголовок, фотография, выносная цитата, три врезки); см. § 2.4, пример 2.</w:t>
+      </w:r>
+    </w:p>
+    <w:p>
+      <w:pPr>
+        <w:rPr>
+          <w:lang w:val="ru-RU"/>
+        </w:rPr>
+      </w:pPr>
+      <w:r>
+        <w:rPr>
+          <w:lang w:val="ru-RU"/>
+        </w:rPr>
+        <w:t xml:space="preserve">Рисунок П3 — «Мир новостей», 29.04.2026, № 18 (1688). Разбор: сдержанная типографика без цветовых акцентов, отсутствие подзаголовков и врезок при тексте около 4 000 знаков; см. § 2.4, пример 3.</w:t>
       </w:r>
     </w:p>
     <w:sectPr>

</xml_diff>